<commit_message>
Deployment Record v1.0 -> v1.1: add MariaDB and nginx version numbers
Section 6.3 (Container Stack table) now shows espocrm-db as
mariadb:latest (12.2.2) and espocrm-nginx as nginx (1.29.7), in
addition to the existing image references.

Section 6.5 (Database) split the previous combined 'Engine' row
into separate Engine, Version, and Image rows so the version
appears as its own labeled field.

Both versions retrieved via SSH from the running containers
(docker exec espocrm-db mariadb --version, docker exec espocrm-nginx
nginx -v) for consistency with the EspoCRM application version
(9.3.4) already captured in v1.0.

Metadata Last Updated bumped to 05-02-26 05:30. Revision History
and Change Log updated with the v1.1 entry. No other content
changes.
</commit_message>
<xml_diff>
--- a/PRDs/deployment/CBM-Test-Instance-Deployment-Record.docx
+++ b/PRDs/deployment/CBM-Test-Instance-Deployment-Record.docx
@@ -274,7 +274,7 @@
                 <w:b w:val="false"/>
                 <w:bCs w:val="false"/>
               </w:rPr>
-              <w:t xml:space="preserve">1.0</w:t>
+              <w:t xml:space="preserve">1.1</w:t>
             </w:r>
           </w:p>
         </w:tc>
@@ -388,7 +388,7 @@
                 <w:b w:val="false"/>
                 <w:bCs w:val="false"/>
               </w:rPr>
-              <w:t xml:space="preserve">05-02-26 04:45</w:t>
+              <w:t xml:space="preserve">05-02-26 05:30</w:t>
             </w:r>
           </w:p>
         </w:tc>
@@ -625,6 +625,90 @@
                 <w:b w:val="false"/>
                 <w:bCs w:val="false"/>
               </w:rPr>
+              <w:t xml:space="preserve">1.1</w:t>
+            </w:r>
+          </w:p>
+        </w:tc>
+        <w:tc>
+          <w:tcPr>
+            <w:tcW w:type="dxa" w:w="1500"/>
+            <w:tcBorders>
+              <w:top w:val="single" w:color="AAAAAA" w:sz="4"/>
+              <w:left w:val="single" w:color="AAAAAA" w:sz="4"/>
+              <w:bottom w:val="single" w:color="AAAAAA" w:sz="4"/>
+              <w:right w:val="single" w:color="AAAAAA" w:sz="4"/>
+            </w:tcBorders>
+            <w:tcMar>
+              <w:top w:type="dxa" w:w="80"/>
+              <w:left w:type="dxa" w:w="120"/>
+              <w:bottom w:type="dxa" w:w="80"/>
+              <w:right w:type="dxa" w:w="120"/>
+            </w:tcMar>
+          </w:tcPr>
+          <w:p>
+            <w:r>
+              <w:rPr>
+                <w:rFonts w:ascii="Arial" w:cs="Arial" w:eastAsia="Arial" w:hAnsi="Arial"/>
+                <w:b w:val="false"/>
+                <w:bCs w:val="false"/>
+              </w:rPr>
+              <w:t xml:space="preserve">05-02-26 05:30</w:t>
+            </w:r>
+          </w:p>
+        </w:tc>
+        <w:tc>
+          <w:tcPr>
+            <w:tcW w:type="dxa" w:w="7060"/>
+            <w:tcBorders>
+              <w:top w:val="single" w:color="AAAAAA" w:sz="4"/>
+              <w:left w:val="single" w:color="AAAAAA" w:sz="4"/>
+              <w:bottom w:val="single" w:color="AAAAAA" w:sz="4"/>
+              <w:right w:val="single" w:color="AAAAAA" w:sz="4"/>
+            </w:tcBorders>
+            <w:tcMar>
+              <w:top w:type="dxa" w:w="80"/>
+              <w:left w:type="dxa" w:w="120"/>
+              <w:bottom w:type="dxa" w:w="80"/>
+              <w:right w:type="dxa" w:w="120"/>
+            </w:tcMar>
+          </w:tcPr>
+          <w:p>
+            <w:r>
+              <w:rPr>
+                <w:rFonts w:ascii="Arial" w:cs="Arial" w:eastAsia="Arial" w:hAnsi="Arial"/>
+                <w:b w:val="false"/>
+                <w:bCs w:val="false"/>
+              </w:rPr>
+              <w:t xml:space="preserve">Added MariaDB and nginx version numbers to Section 6 (EspoCRM Application). Both retrieved from the running containers via SSH for consistency with the EspoCRM version already captured. No other content changes.</w:t>
+            </w:r>
+          </w:p>
+        </w:tc>
+      </w:tr>
+      <w:tr>
+        <w:tc>
+          <w:tcPr>
+            <w:tcW w:type="dxa" w:w="800"/>
+            <w:tcBorders>
+              <w:top w:val="single" w:color="AAAAAA" w:sz="4"/>
+              <w:left w:val="single" w:color="AAAAAA" w:sz="4"/>
+              <w:bottom w:val="single" w:color="AAAAAA" w:sz="4"/>
+              <w:right w:val="single" w:color="AAAAAA" w:sz="4"/>
+            </w:tcBorders>
+            <w:shd w:fill="F2F7FB" w:val="clear"/>
+            <w:tcMar>
+              <w:top w:type="dxa" w:w="80"/>
+              <w:left w:type="dxa" w:w="120"/>
+              <w:bottom w:type="dxa" w:w="80"/>
+              <w:right w:type="dxa" w:w="120"/>
+            </w:tcMar>
+          </w:tcPr>
+          <w:p>
+            <w:r>
+              <w:rPr>
+                <w:rFonts w:ascii="Arial" w:cs="Arial" w:eastAsia="Arial" w:hAnsi="Arial"/>
+                <w:b w:val="false"/>
+                <w:bCs w:val="false"/>
+              </w:rPr>
               <w:t xml:space="preserve">1.0</w:t>
             </w:r>
           </w:p>
@@ -638,6 +722,7 @@
               <w:bottom w:val="single" w:color="AAAAAA" w:sz="4"/>
               <w:right w:val="single" w:color="AAAAAA" w:sz="4"/>
             </w:tcBorders>
+            <w:shd w:fill="F2F7FB" w:val="clear"/>
             <w:tcMar>
               <w:top w:type="dxa" w:w="80"/>
               <w:left w:type="dxa" w:w="120"/>
@@ -665,6 +750,7 @@
               <w:bottom w:val="single" w:color="AAAAAA" w:sz="4"/>
               <w:right w:val="single" w:color="AAAAAA" w:sz="4"/>
             </w:tcBorders>
+            <w:shd w:fill="F2F7FB" w:val="clear"/>
             <w:tcMar>
               <w:top w:type="dxa" w:w="80"/>
               <w:left w:type="dxa" w:w="120"/>
@@ -4984,7 +5070,7 @@
                 <w:b w:val="false"/>
                 <w:bCs w:val="false"/>
               </w:rPr>
-              <w:t xml:space="preserve">mariadb:latest</w:t>
+              <w:t xml:space="preserve">mariadb:latest (12.2.2)</w:t>
             </w:r>
           </w:p>
         </w:tc>
@@ -5069,7 +5155,7 @@
                 <w:b w:val="false"/>
                 <w:bCs w:val="false"/>
               </w:rPr>
-              <w:t xml:space="preserve">nginx</w:t>
+              <w:t xml:space="preserve">nginx (1.29.7)</w:t>
             </w:r>
           </w:p>
         </w:tc>
@@ -5790,7 +5876,121 @@
                 <w:b w:val="false"/>
                 <w:bCs w:val="false"/>
               </w:rPr>
-              <w:t xml:space="preserve">MariaDB (mariadb:latest image)</w:t>
+              <w:t xml:space="preserve">MariaDB</w:t>
+            </w:r>
+          </w:p>
+        </w:tc>
+      </w:tr>
+      <w:tr>
+        <w:tc>
+          <w:tcPr>
+            <w:tcW w:type="dxa" w:w="2600"/>
+            <w:tcBorders>
+              <w:top w:val="single" w:color="AAAAAA" w:sz="4"/>
+              <w:left w:val="single" w:color="AAAAAA" w:sz="4"/>
+              <w:bottom w:val="single" w:color="AAAAAA" w:sz="4"/>
+              <w:right w:val="single" w:color="AAAAAA" w:sz="4"/>
+            </w:tcBorders>
+            <w:shd w:fill="F2F7FB" w:val="clear"/>
+            <w:tcMar>
+              <w:top w:type="dxa" w:w="80"/>
+              <w:left w:type="dxa" w:w="120"/>
+              <w:bottom w:type="dxa" w:w="80"/>
+              <w:right w:type="dxa" w:w="120"/>
+            </w:tcMar>
+          </w:tcPr>
+          <w:p>
+            <w:r>
+              <w:rPr>
+                <w:rFonts w:ascii="Arial" w:cs="Arial" w:eastAsia="Arial" w:hAnsi="Arial"/>
+                <w:b w:val="false"/>
+                <w:bCs w:val="false"/>
+              </w:rPr>
+              <w:t xml:space="preserve">Version</w:t>
+            </w:r>
+          </w:p>
+        </w:tc>
+        <w:tc>
+          <w:tcPr>
+            <w:tcW w:type="dxa" w:w="6760"/>
+            <w:tcBorders>
+              <w:top w:val="single" w:color="AAAAAA" w:sz="4"/>
+              <w:left w:val="single" w:color="AAAAAA" w:sz="4"/>
+              <w:bottom w:val="single" w:color="AAAAAA" w:sz="4"/>
+              <w:right w:val="single" w:color="AAAAAA" w:sz="4"/>
+            </w:tcBorders>
+            <w:shd w:fill="F2F7FB" w:val="clear"/>
+            <w:tcMar>
+              <w:top w:type="dxa" w:w="80"/>
+              <w:left w:type="dxa" w:w="120"/>
+              <w:bottom w:type="dxa" w:w="80"/>
+              <w:right w:type="dxa" w:w="120"/>
+            </w:tcMar>
+          </w:tcPr>
+          <w:p>
+            <w:r>
+              <w:rPr>
+                <w:rFonts w:ascii="Arial" w:cs="Arial" w:eastAsia="Arial" w:hAnsi="Arial"/>
+                <w:b w:val="false"/>
+                <w:bCs w:val="false"/>
+              </w:rPr>
+              <w:t xml:space="preserve">12.2.2</w:t>
+            </w:r>
+          </w:p>
+        </w:tc>
+      </w:tr>
+      <w:tr>
+        <w:tc>
+          <w:tcPr>
+            <w:tcW w:type="dxa" w:w="2600"/>
+            <w:tcBorders>
+              <w:top w:val="single" w:color="AAAAAA" w:sz="4"/>
+              <w:left w:val="single" w:color="AAAAAA" w:sz="4"/>
+              <w:bottom w:val="single" w:color="AAAAAA" w:sz="4"/>
+              <w:right w:val="single" w:color="AAAAAA" w:sz="4"/>
+            </w:tcBorders>
+            <w:tcMar>
+              <w:top w:type="dxa" w:w="80"/>
+              <w:left w:type="dxa" w:w="120"/>
+              <w:bottom w:type="dxa" w:w="80"/>
+              <w:right w:type="dxa" w:w="120"/>
+            </w:tcMar>
+          </w:tcPr>
+          <w:p>
+            <w:r>
+              <w:rPr>
+                <w:rFonts w:ascii="Arial" w:cs="Arial" w:eastAsia="Arial" w:hAnsi="Arial"/>
+                <w:b w:val="false"/>
+                <w:bCs w:val="false"/>
+              </w:rPr>
+              <w:t xml:space="preserve">Image</w:t>
+            </w:r>
+          </w:p>
+        </w:tc>
+        <w:tc>
+          <w:tcPr>
+            <w:tcW w:type="dxa" w:w="6760"/>
+            <w:tcBorders>
+              <w:top w:val="single" w:color="AAAAAA" w:sz="4"/>
+              <w:left w:val="single" w:color="AAAAAA" w:sz="4"/>
+              <w:bottom w:val="single" w:color="AAAAAA" w:sz="4"/>
+              <w:right w:val="single" w:color="AAAAAA" w:sz="4"/>
+            </w:tcBorders>
+            <w:tcMar>
+              <w:top w:type="dxa" w:w="80"/>
+              <w:left w:type="dxa" w:w="120"/>
+              <w:bottom w:type="dxa" w:w="80"/>
+              <w:right w:type="dxa" w:w="120"/>
+            </w:tcMar>
+          </w:tcPr>
+          <w:p>
+            <w:r>
+              <w:rPr>
+                <w:rFonts w:ascii="Arial" w:cs="Arial" w:eastAsia="Arial" w:hAnsi="Arial"/>
+                <w:b w:val="false"/>
+                <w:bCs w:val="false"/>
+              </w:rPr>
+              <w:t xml:space="preserve">mariadb:latest</w:t>
             </w:r>
           </w:p>
         </w:tc>
@@ -8475,6 +8675,90 @@
                 <w:b w:val="false"/>
                 <w:bCs w:val="false"/>
               </w:rPr>
+              <w:t xml:space="preserve">1.1</w:t>
+            </w:r>
+          </w:p>
+        </w:tc>
+        <w:tc>
+          <w:tcPr>
+            <w:tcW w:type="dxa" w:w="1500"/>
+            <w:tcBorders>
+              <w:top w:val="single" w:color="AAAAAA" w:sz="4"/>
+              <w:left w:val="single" w:color="AAAAAA" w:sz="4"/>
+              <w:bottom w:val="single" w:color="AAAAAA" w:sz="4"/>
+              <w:right w:val="single" w:color="AAAAAA" w:sz="4"/>
+            </w:tcBorders>
+            <w:tcMar>
+              <w:top w:type="dxa" w:w="80"/>
+              <w:left w:type="dxa" w:w="120"/>
+              <w:bottom w:type="dxa" w:w="80"/>
+              <w:right w:type="dxa" w:w="120"/>
+            </w:tcMar>
+          </w:tcPr>
+          <w:p>
+            <w:r>
+              <w:rPr>
+                <w:rFonts w:ascii="Arial" w:cs="Arial" w:eastAsia="Arial" w:hAnsi="Arial"/>
+                <w:b w:val="false"/>
+                <w:bCs w:val="false"/>
+              </w:rPr>
+              <w:t xml:space="preserve">05-02-26 05:30</w:t>
+            </w:r>
+          </w:p>
+        </w:tc>
+        <w:tc>
+          <w:tcPr>
+            <w:tcW w:type="dxa" w:w="7060"/>
+            <w:tcBorders>
+              <w:top w:val="single" w:color="AAAAAA" w:sz="4"/>
+              <w:left w:val="single" w:color="AAAAAA" w:sz="4"/>
+              <w:bottom w:val="single" w:color="AAAAAA" w:sz="4"/>
+              <w:right w:val="single" w:color="AAAAAA" w:sz="4"/>
+            </w:tcBorders>
+            <w:tcMar>
+              <w:top w:type="dxa" w:w="80"/>
+              <w:left w:type="dxa" w:w="120"/>
+              <w:bottom w:type="dxa" w:w="80"/>
+              <w:right w:type="dxa" w:w="120"/>
+            </w:tcMar>
+          </w:tcPr>
+          <w:p>
+            <w:r>
+              <w:rPr>
+                <w:rFonts w:ascii="Arial" w:cs="Arial" w:eastAsia="Arial" w:hAnsi="Arial"/>
+                <w:b w:val="false"/>
+                <w:bCs w:val="false"/>
+              </w:rPr>
+              <w:t xml:space="preserve">Added MariaDB version (12.2.2) and nginx version (1.29.7) to Section 6.3 (Container Stack) and Section 6.5 (Database). Both versions retrieved via SSH from the running containers, for consistency with the EspoCRM version (9.3.4) already captured. Section 6.5 split the previous combined Engine entry into separate Engine, Version, and Image rows. No other content changes; metadata Last Updated bumped to 05-02-26 05:30.</w:t>
+            </w:r>
+          </w:p>
+        </w:tc>
+      </w:tr>
+      <w:tr>
+        <w:tc>
+          <w:tcPr>
+            <w:tcW w:type="dxa" w:w="800"/>
+            <w:tcBorders>
+              <w:top w:val="single" w:color="AAAAAA" w:sz="4"/>
+              <w:left w:val="single" w:color="AAAAAA" w:sz="4"/>
+              <w:bottom w:val="single" w:color="AAAAAA" w:sz="4"/>
+              <w:right w:val="single" w:color="AAAAAA" w:sz="4"/>
+            </w:tcBorders>
+            <w:shd w:fill="F2F7FB" w:val="clear"/>
+            <w:tcMar>
+              <w:top w:type="dxa" w:w="80"/>
+              <w:left w:type="dxa" w:w="120"/>
+              <w:bottom w:type="dxa" w:w="80"/>
+              <w:right w:type="dxa" w:w="120"/>
+            </w:tcMar>
+          </w:tcPr>
+          <w:p>
+            <w:r>
+              <w:rPr>
+                <w:rFonts w:ascii="Arial" w:cs="Arial" w:eastAsia="Arial" w:hAnsi="Arial"/>
+                <w:b w:val="false"/>
+                <w:bCs w:val="false"/>
+              </w:rPr>
               <w:t xml:space="preserve">1.0</w:t>
             </w:r>
           </w:p>
@@ -8488,6 +8772,7 @@
               <w:bottom w:val="single" w:color="AAAAAA" w:sz="4"/>
               <w:right w:val="single" w:color="AAAAAA" w:sz="4"/>
             </w:tcBorders>
+            <w:shd w:fill="F2F7FB" w:val="clear"/>
             <w:tcMar>
               <w:top w:type="dxa" w:w="80"/>
               <w:left w:type="dxa" w:w="120"/>
@@ -8515,6 +8800,7 @@
               <w:bottom w:val="single" w:color="AAAAAA" w:sz="4"/>
               <w:right w:val="single" w:color="AAAAAA" w:sz="4"/>
             </w:tcBorders>
+            <w:shd w:fill="F2F7FB" w:val="clear"/>
             <w:tcMar>
               <w:top w:type="dxa" w:w="80"/>
               <w:left w:type="dxa" w:w="120"/>

</xml_diff>

<commit_message>
Deployment Record v1.1 -> v1.2: add DigitalOcean Droplet URLs
Section 3.1 (Droplet Identification) gains three new rows:
- Droplet ID: 561480073
- Droplet detail page: https://cloud.digitalocean.com/droplets/561480073
- In-browser Console: https://cloud.digitalocean.com/droplets/561480073/console

Section 10.1 (Reaching the Server) updated to reference the new
Console URL by section number rather than describing the DO Console
abstractly, making the disaster-recovery fallback path actionable
(click the Section 3.1 link rather than navigate the DO dashboard).

Metadata Last Updated bumped to 05-02-26 05:45. Revision History
and Change Log updated with v1.2 entry.
</commit_message>
<xml_diff>
--- a/PRDs/deployment/CBM-Test-Instance-Deployment-Record.docx
+++ b/PRDs/deployment/CBM-Test-Instance-Deployment-Record.docx
@@ -274,7 +274,7 @@
                 <w:b w:val="false"/>
                 <w:bCs w:val="false"/>
               </w:rPr>
-              <w:t xml:space="preserve">1.1</w:t>
+              <w:t xml:space="preserve">1.2</w:t>
             </w:r>
           </w:p>
         </w:tc>
@@ -388,7 +388,7 @@
                 <w:b w:val="false"/>
                 <w:bCs w:val="false"/>
               </w:rPr>
-              <w:t xml:space="preserve">05-02-26 05:30</w:t>
+              <w:t xml:space="preserve">05-02-26 05:45</w:t>
             </w:r>
           </w:p>
         </w:tc>
@@ -625,6 +625,90 @@
                 <w:b w:val="false"/>
                 <w:bCs w:val="false"/>
               </w:rPr>
+              <w:t xml:space="preserve">1.2</w:t>
+            </w:r>
+          </w:p>
+        </w:tc>
+        <w:tc>
+          <w:tcPr>
+            <w:tcW w:type="dxa" w:w="1500"/>
+            <w:tcBorders>
+              <w:top w:val="single" w:color="AAAAAA" w:sz="4"/>
+              <w:left w:val="single" w:color="AAAAAA" w:sz="4"/>
+              <w:bottom w:val="single" w:color="AAAAAA" w:sz="4"/>
+              <w:right w:val="single" w:color="AAAAAA" w:sz="4"/>
+            </w:tcBorders>
+            <w:tcMar>
+              <w:top w:type="dxa" w:w="80"/>
+              <w:left w:type="dxa" w:w="120"/>
+              <w:bottom w:type="dxa" w:w="80"/>
+              <w:right w:type="dxa" w:w="120"/>
+            </w:tcMar>
+          </w:tcPr>
+          <w:p>
+            <w:r>
+              <w:rPr>
+                <w:rFonts w:ascii="Arial" w:cs="Arial" w:eastAsia="Arial" w:hAnsi="Arial"/>
+                <w:b w:val="false"/>
+                <w:bCs w:val="false"/>
+              </w:rPr>
+              <w:t xml:space="preserve">05-02-26 05:45</w:t>
+            </w:r>
+          </w:p>
+        </w:tc>
+        <w:tc>
+          <w:tcPr>
+            <w:tcW w:type="dxa" w:w="7060"/>
+            <w:tcBorders>
+              <w:top w:val="single" w:color="AAAAAA" w:sz="4"/>
+              <w:left w:val="single" w:color="AAAAAA" w:sz="4"/>
+              <w:bottom w:val="single" w:color="AAAAAA" w:sz="4"/>
+              <w:right w:val="single" w:color="AAAAAA" w:sz="4"/>
+            </w:tcBorders>
+            <w:tcMar>
+              <w:top w:type="dxa" w:w="80"/>
+              <w:left w:type="dxa" w:w="120"/>
+              <w:bottom w:type="dxa" w:w="80"/>
+              <w:right w:type="dxa" w:w="120"/>
+            </w:tcMar>
+          </w:tcPr>
+          <w:p>
+            <w:r>
+              <w:rPr>
+                <w:rFonts w:ascii="Arial" w:cs="Arial" w:eastAsia="Arial" w:hAnsi="Arial"/>
+                <w:b w:val="false"/>
+                <w:bCs w:val="false"/>
+              </w:rPr>
+              <w:t xml:space="preserve">Added the DigitalOcean Droplet ID, the Droplet detail page URL, and the in-browser Console URL to Section 3.1 (Droplet Identification). Both URLs derive from the numeric Droplet ID; supplying the URLs directly removes the need for an operator to browse the DO Droplets list to locate this server. No other content changes.</w:t>
+            </w:r>
+          </w:p>
+        </w:tc>
+      </w:tr>
+      <w:tr>
+        <w:tc>
+          <w:tcPr>
+            <w:tcW w:type="dxa" w:w="800"/>
+            <w:tcBorders>
+              <w:top w:val="single" w:color="AAAAAA" w:sz="4"/>
+              <w:left w:val="single" w:color="AAAAAA" w:sz="4"/>
+              <w:bottom w:val="single" w:color="AAAAAA" w:sz="4"/>
+              <w:right w:val="single" w:color="AAAAAA" w:sz="4"/>
+            </w:tcBorders>
+            <w:shd w:fill="F2F7FB" w:val="clear"/>
+            <w:tcMar>
+              <w:top w:type="dxa" w:w="80"/>
+              <w:left w:type="dxa" w:w="120"/>
+              <w:bottom w:type="dxa" w:w="80"/>
+              <w:right w:type="dxa" w:w="120"/>
+            </w:tcMar>
+          </w:tcPr>
+          <w:p>
+            <w:r>
+              <w:rPr>
+                <w:rFonts w:ascii="Arial" w:cs="Arial" w:eastAsia="Arial" w:hAnsi="Arial"/>
+                <w:b w:val="false"/>
+                <w:bCs w:val="false"/>
+              </w:rPr>
               <w:t xml:space="preserve">1.1</w:t>
             </w:r>
           </w:p>
@@ -638,6 +722,7 @@
               <w:bottom w:val="single" w:color="AAAAAA" w:sz="4"/>
               <w:right w:val="single" w:color="AAAAAA" w:sz="4"/>
             </w:tcBorders>
+            <w:shd w:fill="F2F7FB" w:val="clear"/>
             <w:tcMar>
               <w:top w:type="dxa" w:w="80"/>
               <w:left w:type="dxa" w:w="120"/>
@@ -665,6 +750,7 @@
               <w:bottom w:val="single" w:color="AAAAAA" w:sz="4"/>
               <w:right w:val="single" w:color="AAAAAA" w:sz="4"/>
             </w:tcBorders>
+            <w:shd w:fill="F2F7FB" w:val="clear"/>
             <w:tcMar>
               <w:top w:type="dxa" w:w="80"/>
               <w:left w:type="dxa" w:w="120"/>
@@ -694,7 +780,6 @@
               <w:bottom w:val="single" w:color="AAAAAA" w:sz="4"/>
               <w:right w:val="single" w:color="AAAAAA" w:sz="4"/>
             </w:tcBorders>
-            <w:shd w:fill="F2F7FB" w:val="clear"/>
             <w:tcMar>
               <w:top w:type="dxa" w:w="80"/>
               <w:left w:type="dxa" w:w="120"/>
@@ -722,7 +807,6 @@
               <w:bottom w:val="single" w:color="AAAAAA" w:sz="4"/>
               <w:right w:val="single" w:color="AAAAAA" w:sz="4"/>
             </w:tcBorders>
-            <w:shd w:fill="F2F7FB" w:val="clear"/>
             <w:tcMar>
               <w:top w:type="dxa" w:w="80"/>
               <w:left w:type="dxa" w:w="120"/>
@@ -750,7 +834,6 @@
               <w:bottom w:val="single" w:color="AAAAAA" w:sz="4"/>
               <w:right w:val="single" w:color="AAAAAA" w:sz="4"/>
             </w:tcBorders>
-            <w:shd w:fill="F2F7FB" w:val="clear"/>
             <w:tcMar>
               <w:top w:type="dxa" w:w="80"/>
               <w:left w:type="dxa" w:w="120"/>
@@ -2380,6 +2463,178 @@
                 <w:bCs w:val="false"/>
               </w:rPr>
               <w:t xml:space="preserve">104.131.45.208</w:t>
+            </w:r>
+          </w:p>
+        </w:tc>
+      </w:tr>
+      <w:tr>
+        <w:tc>
+          <w:tcPr>
+            <w:tcW w:type="dxa" w:w="2600"/>
+            <w:tcBorders>
+              <w:top w:val="single" w:color="AAAAAA" w:sz="4"/>
+              <w:left w:val="single" w:color="AAAAAA" w:sz="4"/>
+              <w:bottom w:val="single" w:color="AAAAAA" w:sz="4"/>
+              <w:right w:val="single" w:color="AAAAAA" w:sz="4"/>
+            </w:tcBorders>
+            <w:shd w:fill="F2F7FB" w:val="clear"/>
+            <w:tcMar>
+              <w:top w:type="dxa" w:w="80"/>
+              <w:left w:type="dxa" w:w="120"/>
+              <w:bottom w:type="dxa" w:w="80"/>
+              <w:right w:type="dxa" w:w="120"/>
+            </w:tcMar>
+          </w:tcPr>
+          <w:p>
+            <w:r>
+              <w:rPr>
+                <w:rFonts w:ascii="Arial" w:cs="Arial" w:eastAsia="Arial" w:hAnsi="Arial"/>
+                <w:b w:val="false"/>
+                <w:bCs w:val="false"/>
+              </w:rPr>
+              <w:t xml:space="preserve">Droplet ID</w:t>
+            </w:r>
+          </w:p>
+        </w:tc>
+        <w:tc>
+          <w:tcPr>
+            <w:tcW w:type="dxa" w:w="6760"/>
+            <w:tcBorders>
+              <w:top w:val="single" w:color="AAAAAA" w:sz="4"/>
+              <w:left w:val="single" w:color="AAAAAA" w:sz="4"/>
+              <w:bottom w:val="single" w:color="AAAAAA" w:sz="4"/>
+              <w:right w:val="single" w:color="AAAAAA" w:sz="4"/>
+            </w:tcBorders>
+            <w:shd w:fill="F2F7FB" w:val="clear"/>
+            <w:tcMar>
+              <w:top w:type="dxa" w:w="80"/>
+              <w:left w:type="dxa" w:w="120"/>
+              <w:bottom w:type="dxa" w:w="80"/>
+              <w:right w:type="dxa" w:w="120"/>
+            </w:tcMar>
+          </w:tcPr>
+          <w:p>
+            <w:r>
+              <w:rPr>
+                <w:rFonts w:ascii="Arial" w:cs="Arial" w:eastAsia="Arial" w:hAnsi="Arial"/>
+                <w:b w:val="false"/>
+                <w:bCs w:val="false"/>
+              </w:rPr>
+              <w:t xml:space="preserve">561480073</w:t>
+            </w:r>
+          </w:p>
+        </w:tc>
+      </w:tr>
+      <w:tr>
+        <w:tc>
+          <w:tcPr>
+            <w:tcW w:type="dxa" w:w="2600"/>
+            <w:tcBorders>
+              <w:top w:val="single" w:color="AAAAAA" w:sz="4"/>
+              <w:left w:val="single" w:color="AAAAAA" w:sz="4"/>
+              <w:bottom w:val="single" w:color="AAAAAA" w:sz="4"/>
+              <w:right w:val="single" w:color="AAAAAA" w:sz="4"/>
+            </w:tcBorders>
+            <w:tcMar>
+              <w:top w:type="dxa" w:w="80"/>
+              <w:left w:type="dxa" w:w="120"/>
+              <w:bottom w:type="dxa" w:w="80"/>
+              <w:right w:type="dxa" w:w="120"/>
+            </w:tcMar>
+          </w:tcPr>
+          <w:p>
+            <w:r>
+              <w:rPr>
+                <w:rFonts w:ascii="Arial" w:cs="Arial" w:eastAsia="Arial" w:hAnsi="Arial"/>
+                <w:b w:val="false"/>
+                <w:bCs w:val="false"/>
+              </w:rPr>
+              <w:t xml:space="preserve">Droplet detail page</w:t>
+            </w:r>
+          </w:p>
+        </w:tc>
+        <w:tc>
+          <w:tcPr>
+            <w:tcW w:type="dxa" w:w="6760"/>
+            <w:tcBorders>
+              <w:top w:val="single" w:color="AAAAAA" w:sz="4"/>
+              <w:left w:val="single" w:color="AAAAAA" w:sz="4"/>
+              <w:bottom w:val="single" w:color="AAAAAA" w:sz="4"/>
+              <w:right w:val="single" w:color="AAAAAA" w:sz="4"/>
+            </w:tcBorders>
+            <w:tcMar>
+              <w:top w:type="dxa" w:w="80"/>
+              <w:left w:type="dxa" w:w="120"/>
+              <w:bottom w:type="dxa" w:w="80"/>
+              <w:right w:type="dxa" w:w="120"/>
+            </w:tcMar>
+          </w:tcPr>
+          <w:p>
+            <w:r>
+              <w:rPr>
+                <w:rFonts w:ascii="Arial" w:cs="Arial" w:eastAsia="Arial" w:hAnsi="Arial"/>
+                <w:b w:val="false"/>
+                <w:bCs w:val="false"/>
+              </w:rPr>
+              <w:t xml:space="preserve">https://cloud.digitalocean.com/droplets/561480073</w:t>
+            </w:r>
+          </w:p>
+        </w:tc>
+      </w:tr>
+      <w:tr>
+        <w:tc>
+          <w:tcPr>
+            <w:tcW w:type="dxa" w:w="2600"/>
+            <w:tcBorders>
+              <w:top w:val="single" w:color="AAAAAA" w:sz="4"/>
+              <w:left w:val="single" w:color="AAAAAA" w:sz="4"/>
+              <w:bottom w:val="single" w:color="AAAAAA" w:sz="4"/>
+              <w:right w:val="single" w:color="AAAAAA" w:sz="4"/>
+            </w:tcBorders>
+            <w:shd w:fill="F2F7FB" w:val="clear"/>
+            <w:tcMar>
+              <w:top w:type="dxa" w:w="80"/>
+              <w:left w:type="dxa" w:w="120"/>
+              <w:bottom w:type="dxa" w:w="80"/>
+              <w:right w:type="dxa" w:w="120"/>
+            </w:tcMar>
+          </w:tcPr>
+          <w:p>
+            <w:r>
+              <w:rPr>
+                <w:rFonts w:ascii="Arial" w:cs="Arial" w:eastAsia="Arial" w:hAnsi="Arial"/>
+                <w:b w:val="false"/>
+                <w:bCs w:val="false"/>
+              </w:rPr>
+              <w:t xml:space="preserve">In-browser Console</w:t>
+            </w:r>
+          </w:p>
+        </w:tc>
+        <w:tc>
+          <w:tcPr>
+            <w:tcW w:type="dxa" w:w="6760"/>
+            <w:tcBorders>
+              <w:top w:val="single" w:color="AAAAAA" w:sz="4"/>
+              <w:left w:val="single" w:color="AAAAAA" w:sz="4"/>
+              <w:bottom w:val="single" w:color="AAAAAA" w:sz="4"/>
+              <w:right w:val="single" w:color="AAAAAA" w:sz="4"/>
+            </w:tcBorders>
+            <w:shd w:fill="F2F7FB" w:val="clear"/>
+            <w:tcMar>
+              <w:top w:type="dxa" w:w="80"/>
+              <w:left w:type="dxa" w:w="120"/>
+              <w:bottom w:type="dxa" w:w="80"/>
+              <w:right w:type="dxa" w:w="120"/>
+            </w:tcMar>
+          </w:tcPr>
+          <w:p>
+            <w:r>
+              <w:rPr>
+                <w:rFonts w:ascii="Arial" w:cs="Arial" w:eastAsia="Arial" w:hAnsi="Arial"/>
+                <w:b w:val="false"/>
+                <w:bCs w:val="false"/>
+              </w:rPr>
+              <w:t xml:space="preserve">https://cloud.digitalocean.com/droplets/561480073/console</w:t>
             </w:r>
           </w:p>
         </w:tc>
@@ -7880,7 +8135,7 @@
           <w:b w:val="false"/>
           <w:bCs w:val="false"/>
         </w:rPr>
-        <w:t xml:space="preserve">SSH using the crm-deploy private key. The DigitalOcean console (Droplet page in the DO dashboard) is also available as a fallback if SSH is unreachable for any reason.</w:t>
+        <w:t xml:space="preserve">SSH using the crm-deploy private key is the primary access path. The DigitalOcean in-browser Console (linked in Section 3.1) is the documented fallback when SSH is unreachable for any reason — for example after a firewall misconfiguration that blocks port 22, or while diagnosing a network-layer issue from outside the server.</w:t>
       </w:r>
     </w:p>
     <w:p>
@@ -8675,6 +8930,90 @@
                 <w:b w:val="false"/>
                 <w:bCs w:val="false"/>
               </w:rPr>
+              <w:t xml:space="preserve">1.2</w:t>
+            </w:r>
+          </w:p>
+        </w:tc>
+        <w:tc>
+          <w:tcPr>
+            <w:tcW w:type="dxa" w:w="1500"/>
+            <w:tcBorders>
+              <w:top w:val="single" w:color="AAAAAA" w:sz="4"/>
+              <w:left w:val="single" w:color="AAAAAA" w:sz="4"/>
+              <w:bottom w:val="single" w:color="AAAAAA" w:sz="4"/>
+              <w:right w:val="single" w:color="AAAAAA" w:sz="4"/>
+            </w:tcBorders>
+            <w:tcMar>
+              <w:top w:type="dxa" w:w="80"/>
+              <w:left w:type="dxa" w:w="120"/>
+              <w:bottom w:type="dxa" w:w="80"/>
+              <w:right w:type="dxa" w:w="120"/>
+            </w:tcMar>
+          </w:tcPr>
+          <w:p>
+            <w:r>
+              <w:rPr>
+                <w:rFonts w:ascii="Arial" w:cs="Arial" w:eastAsia="Arial" w:hAnsi="Arial"/>
+                <w:b w:val="false"/>
+                <w:bCs w:val="false"/>
+              </w:rPr>
+              <w:t xml:space="preserve">05-02-26 05:45</w:t>
+            </w:r>
+          </w:p>
+        </w:tc>
+        <w:tc>
+          <w:tcPr>
+            <w:tcW w:type="dxa" w:w="7060"/>
+            <w:tcBorders>
+              <w:top w:val="single" w:color="AAAAAA" w:sz="4"/>
+              <w:left w:val="single" w:color="AAAAAA" w:sz="4"/>
+              <w:bottom w:val="single" w:color="AAAAAA" w:sz="4"/>
+              <w:right w:val="single" w:color="AAAAAA" w:sz="4"/>
+            </w:tcBorders>
+            <w:tcMar>
+              <w:top w:type="dxa" w:w="80"/>
+              <w:left w:type="dxa" w:w="120"/>
+              <w:bottom w:type="dxa" w:w="80"/>
+              <w:right w:type="dxa" w:w="120"/>
+            </w:tcMar>
+          </w:tcPr>
+          <w:p>
+            <w:r>
+              <w:rPr>
+                <w:rFonts w:ascii="Arial" w:cs="Arial" w:eastAsia="Arial" w:hAnsi="Arial"/>
+                <w:b w:val="false"/>
+                <w:bCs w:val="false"/>
+              </w:rPr>
+              <w:t xml:space="preserve">Added three rows to Section 3.1 (Droplet Identification): Droplet ID (561480073), Droplet detail page URL, and in-browser Console URL. The two URLs are derivable from the Droplet ID but supplying them directly removes the need for an operator to browse the DO Droplets list. Section 10.1 (Reaching the Server) updated to reference the new Console URL by Section 3.1 link rather than describing the Console abstractly. Metadata Last Updated bumped to 05-02-26 05:45.</w:t>
+            </w:r>
+          </w:p>
+        </w:tc>
+      </w:tr>
+      <w:tr>
+        <w:tc>
+          <w:tcPr>
+            <w:tcW w:type="dxa" w:w="800"/>
+            <w:tcBorders>
+              <w:top w:val="single" w:color="AAAAAA" w:sz="4"/>
+              <w:left w:val="single" w:color="AAAAAA" w:sz="4"/>
+              <w:bottom w:val="single" w:color="AAAAAA" w:sz="4"/>
+              <w:right w:val="single" w:color="AAAAAA" w:sz="4"/>
+            </w:tcBorders>
+            <w:shd w:fill="F2F7FB" w:val="clear"/>
+            <w:tcMar>
+              <w:top w:type="dxa" w:w="80"/>
+              <w:left w:type="dxa" w:w="120"/>
+              <w:bottom w:type="dxa" w:w="80"/>
+              <w:right w:type="dxa" w:w="120"/>
+            </w:tcMar>
+          </w:tcPr>
+          <w:p>
+            <w:r>
+              <w:rPr>
+                <w:rFonts w:ascii="Arial" w:cs="Arial" w:eastAsia="Arial" w:hAnsi="Arial"/>
+                <w:b w:val="false"/>
+                <w:bCs w:val="false"/>
+              </w:rPr>
               <w:t xml:space="preserve">1.1</w:t>
             </w:r>
           </w:p>
@@ -8688,6 +9027,7 @@
               <w:bottom w:val="single" w:color="AAAAAA" w:sz="4"/>
               <w:right w:val="single" w:color="AAAAAA" w:sz="4"/>
             </w:tcBorders>
+            <w:shd w:fill="F2F7FB" w:val="clear"/>
             <w:tcMar>
               <w:top w:type="dxa" w:w="80"/>
               <w:left w:type="dxa" w:w="120"/>
@@ -8715,6 +9055,7 @@
               <w:bottom w:val="single" w:color="AAAAAA" w:sz="4"/>
               <w:right w:val="single" w:color="AAAAAA" w:sz="4"/>
             </w:tcBorders>
+            <w:shd w:fill="F2F7FB" w:val="clear"/>
             <w:tcMar>
               <w:top w:type="dxa" w:w="80"/>
               <w:left w:type="dxa" w:w="120"/>
@@ -8744,7 +9085,6 @@
               <w:bottom w:val="single" w:color="AAAAAA" w:sz="4"/>
               <w:right w:val="single" w:color="AAAAAA" w:sz="4"/>
             </w:tcBorders>
-            <w:shd w:fill="F2F7FB" w:val="clear"/>
             <w:tcMar>
               <w:top w:type="dxa" w:w="80"/>
               <w:left w:type="dxa" w:w="120"/>
@@ -8772,7 +9112,6 @@
               <w:bottom w:val="single" w:color="AAAAAA" w:sz="4"/>
               <w:right w:val="single" w:color="AAAAAA" w:sz="4"/>
             </w:tcBorders>
-            <w:shd w:fill="F2F7FB" w:val="clear"/>
             <w:tcMar>
               <w:top w:type="dxa" w:w="80"/>
               <w:left w:type="dxa" w:w="120"/>
@@ -8800,7 +9139,6 @@
               <w:bottom w:val="single" w:color="AAAAAA" w:sz="4"/>
               <w:right w:val="single" w:color="AAAAAA" w:sz="4"/>
             </w:tcBorders>
-            <w:shd w:fill="F2F7FB" w:val="clear"/>
             <w:tcMar>
               <w:top w:type="dxa" w:w="80"/>
               <w:left w:type="dxa" w:w="120"/>

</xml_diff>

<commit_message>
Deployment Record v1.2 -> v1.3: relabel Public IPv4 as SSH Host
Two rows updated from "Public IPv4" to "Public IPv4 (SSH Host)":
- Section 2 (Deployment Summary at-a-glance)
- Section 3.1 (Droplet Identification)

The parenthetical makes explicit that the captured IPv4 value is
the input to the Setup Wizard's SSH Host field on its Server (SSH)
Connection page. Identified during a real wizard run where an
operator noted the SSH Host label had no obvious match in the
Deployment Record.

Metadata Last Updated bumped to 05-02-26 06:50. Revision History
and Change Log updated with v1.3 entry. No other content changes.
</commit_message>
<xml_diff>
--- a/PRDs/deployment/CBM-Test-Instance-Deployment-Record.docx
+++ b/PRDs/deployment/CBM-Test-Instance-Deployment-Record.docx
@@ -274,7 +274,7 @@
                 <w:b w:val="false"/>
                 <w:bCs w:val="false"/>
               </w:rPr>
-              <w:t xml:space="preserve">1.2</w:t>
+              <w:t xml:space="preserve">1.3</w:t>
             </w:r>
           </w:p>
         </w:tc>
@@ -388,7 +388,7 @@
                 <w:b w:val="false"/>
                 <w:bCs w:val="false"/>
               </w:rPr>
-              <w:t xml:space="preserve">05-02-26 05:45</w:t>
+              <w:t xml:space="preserve">05-02-26 06:50</w:t>
             </w:r>
           </w:p>
         </w:tc>
@@ -625,6 +625,90 @@
                 <w:b w:val="false"/>
                 <w:bCs w:val="false"/>
               </w:rPr>
+              <w:t xml:space="preserve">1.3</w:t>
+            </w:r>
+          </w:p>
+        </w:tc>
+        <w:tc>
+          <w:tcPr>
+            <w:tcW w:type="dxa" w:w="1500"/>
+            <w:tcBorders>
+              <w:top w:val="single" w:color="AAAAAA" w:sz="4"/>
+              <w:left w:val="single" w:color="AAAAAA" w:sz="4"/>
+              <w:bottom w:val="single" w:color="AAAAAA" w:sz="4"/>
+              <w:right w:val="single" w:color="AAAAAA" w:sz="4"/>
+            </w:tcBorders>
+            <w:tcMar>
+              <w:top w:type="dxa" w:w="80"/>
+              <w:left w:type="dxa" w:w="120"/>
+              <w:bottom w:type="dxa" w:w="80"/>
+              <w:right w:type="dxa" w:w="120"/>
+            </w:tcMar>
+          </w:tcPr>
+          <w:p>
+            <w:r>
+              <w:rPr>
+                <w:rFonts w:ascii="Arial" w:cs="Arial" w:eastAsia="Arial" w:hAnsi="Arial"/>
+                <w:b w:val="false"/>
+                <w:bCs w:val="false"/>
+              </w:rPr>
+              <w:t xml:space="preserve">05-02-26 06:50</w:t>
+            </w:r>
+          </w:p>
+        </w:tc>
+        <w:tc>
+          <w:tcPr>
+            <w:tcW w:type="dxa" w:w="7060"/>
+            <w:tcBorders>
+              <w:top w:val="single" w:color="AAAAAA" w:sz="4"/>
+              <w:left w:val="single" w:color="AAAAAA" w:sz="4"/>
+              <w:bottom w:val="single" w:color="AAAAAA" w:sz="4"/>
+              <w:right w:val="single" w:color="AAAAAA" w:sz="4"/>
+            </w:tcBorders>
+            <w:tcMar>
+              <w:top w:type="dxa" w:w="80"/>
+              <w:left w:type="dxa" w:w="120"/>
+              <w:bottom w:type="dxa" w:w="80"/>
+              <w:right w:type="dxa" w:w="120"/>
+            </w:tcMar>
+          </w:tcPr>
+          <w:p>
+            <w:r>
+              <w:rPr>
+                <w:rFonts w:ascii="Arial" w:cs="Arial" w:eastAsia="Arial" w:hAnsi="Arial"/>
+                <w:b w:val="false"/>
+                <w:bCs w:val="false"/>
+              </w:rPr>
+              <w:t xml:space="preserve">Relabeled the Public IPv4 row in Section 3.1 (Droplet Identification) to make explicit that this value is the Setup Wizard's SSH Host input. Field now reads "Public IPv4 (SSH Host)". The change addresses operator confusion observed during a wizard run, where the wizard asks for SSH Host but the Deployment Record did not previously connect that label to the captured IPv4 value. No other content changes.</w:t>
+            </w:r>
+          </w:p>
+        </w:tc>
+      </w:tr>
+      <w:tr>
+        <w:tc>
+          <w:tcPr>
+            <w:tcW w:type="dxa" w:w="800"/>
+            <w:tcBorders>
+              <w:top w:val="single" w:color="AAAAAA" w:sz="4"/>
+              <w:left w:val="single" w:color="AAAAAA" w:sz="4"/>
+              <w:bottom w:val="single" w:color="AAAAAA" w:sz="4"/>
+              <w:right w:val="single" w:color="AAAAAA" w:sz="4"/>
+            </w:tcBorders>
+            <w:shd w:fill="F2F7FB" w:val="clear"/>
+            <w:tcMar>
+              <w:top w:type="dxa" w:w="80"/>
+              <w:left w:type="dxa" w:w="120"/>
+              <w:bottom w:type="dxa" w:w="80"/>
+              <w:right w:type="dxa" w:w="120"/>
+            </w:tcMar>
+          </w:tcPr>
+          <w:p>
+            <w:r>
+              <w:rPr>
+                <w:rFonts w:ascii="Arial" w:cs="Arial" w:eastAsia="Arial" w:hAnsi="Arial"/>
+                <w:b w:val="false"/>
+                <w:bCs w:val="false"/>
+              </w:rPr>
               <w:t xml:space="preserve">1.2</w:t>
             </w:r>
           </w:p>
@@ -638,6 +722,7 @@
               <w:bottom w:val="single" w:color="AAAAAA" w:sz="4"/>
               <w:right w:val="single" w:color="AAAAAA" w:sz="4"/>
             </w:tcBorders>
+            <w:shd w:fill="F2F7FB" w:val="clear"/>
             <w:tcMar>
               <w:top w:type="dxa" w:w="80"/>
               <w:left w:type="dxa" w:w="120"/>
@@ -665,6 +750,7 @@
               <w:bottom w:val="single" w:color="AAAAAA" w:sz="4"/>
               <w:right w:val="single" w:color="AAAAAA" w:sz="4"/>
             </w:tcBorders>
+            <w:shd w:fill="F2F7FB" w:val="clear"/>
             <w:tcMar>
               <w:top w:type="dxa" w:w="80"/>
               <w:left w:type="dxa" w:w="120"/>
@@ -694,7 +780,6 @@
               <w:bottom w:val="single" w:color="AAAAAA" w:sz="4"/>
               <w:right w:val="single" w:color="AAAAAA" w:sz="4"/>
             </w:tcBorders>
-            <w:shd w:fill="F2F7FB" w:val="clear"/>
             <w:tcMar>
               <w:top w:type="dxa" w:w="80"/>
               <w:left w:type="dxa" w:w="120"/>
@@ -722,7 +807,6 @@
               <w:bottom w:val="single" w:color="AAAAAA" w:sz="4"/>
               <w:right w:val="single" w:color="AAAAAA" w:sz="4"/>
             </w:tcBorders>
-            <w:shd w:fill="F2F7FB" w:val="clear"/>
             <w:tcMar>
               <w:top w:type="dxa" w:w="80"/>
               <w:left w:type="dxa" w:w="120"/>
@@ -750,7 +834,6 @@
               <w:bottom w:val="single" w:color="AAAAAA" w:sz="4"/>
               <w:right w:val="single" w:color="AAAAAA" w:sz="4"/>
             </w:tcBorders>
-            <w:shd w:fill="F2F7FB" w:val="clear"/>
             <w:tcMar>
               <w:top w:type="dxa" w:w="80"/>
               <w:left w:type="dxa" w:w="120"/>
@@ -780,6 +863,7 @@
               <w:bottom w:val="single" w:color="AAAAAA" w:sz="4"/>
               <w:right w:val="single" w:color="AAAAAA" w:sz="4"/>
             </w:tcBorders>
+            <w:shd w:fill="F2F7FB" w:val="clear"/>
             <w:tcMar>
               <w:top w:type="dxa" w:w="80"/>
               <w:left w:type="dxa" w:w="120"/>
@@ -807,6 +891,7 @@
               <w:bottom w:val="single" w:color="AAAAAA" w:sz="4"/>
               <w:right w:val="single" w:color="AAAAAA" w:sz="4"/>
             </w:tcBorders>
+            <w:shd w:fill="F2F7FB" w:val="clear"/>
             <w:tcMar>
               <w:top w:type="dxa" w:w="80"/>
               <w:left w:type="dxa" w:w="120"/>
@@ -834,6 +919,7 @@
               <w:bottom w:val="single" w:color="AAAAAA" w:sz="4"/>
               <w:right w:val="single" w:color="AAAAAA" w:sz="4"/>
             </w:tcBorders>
+            <w:shd w:fill="F2F7FB" w:val="clear"/>
             <w:tcMar>
               <w:top w:type="dxa" w:w="80"/>
               <w:left w:type="dxa" w:w="120"/>
@@ -1400,7 +1486,7 @@
                 <w:b w:val="false"/>
                 <w:bCs w:val="false"/>
               </w:rPr>
-              <w:t xml:space="preserve">Public IPv4</w:t>
+              <w:t xml:space="preserve">Public IPv4 (SSH Host)</w:t>
             </w:r>
           </w:p>
         </w:tc>
@@ -2435,7 +2521,7 @@
                 <w:b w:val="false"/>
                 <w:bCs w:val="false"/>
               </w:rPr>
-              <w:t xml:space="preserve">Public IPv4</w:t>
+              <w:t xml:space="preserve">Public IPv4 (SSH Host)</w:t>
             </w:r>
           </w:p>
         </w:tc>
@@ -8930,6 +9016,90 @@
                 <w:b w:val="false"/>
                 <w:bCs w:val="false"/>
               </w:rPr>
+              <w:t xml:space="preserve">1.3</w:t>
+            </w:r>
+          </w:p>
+        </w:tc>
+        <w:tc>
+          <w:tcPr>
+            <w:tcW w:type="dxa" w:w="1500"/>
+            <w:tcBorders>
+              <w:top w:val="single" w:color="AAAAAA" w:sz="4"/>
+              <w:left w:val="single" w:color="AAAAAA" w:sz="4"/>
+              <w:bottom w:val="single" w:color="AAAAAA" w:sz="4"/>
+              <w:right w:val="single" w:color="AAAAAA" w:sz="4"/>
+            </w:tcBorders>
+            <w:tcMar>
+              <w:top w:type="dxa" w:w="80"/>
+              <w:left w:type="dxa" w:w="120"/>
+              <w:bottom w:type="dxa" w:w="80"/>
+              <w:right w:type="dxa" w:w="120"/>
+            </w:tcMar>
+          </w:tcPr>
+          <w:p>
+            <w:r>
+              <w:rPr>
+                <w:rFonts w:ascii="Arial" w:cs="Arial" w:eastAsia="Arial" w:hAnsi="Arial"/>
+                <w:b w:val="false"/>
+                <w:bCs w:val="false"/>
+              </w:rPr>
+              <w:t xml:space="preserve">05-02-26 06:50</w:t>
+            </w:r>
+          </w:p>
+        </w:tc>
+        <w:tc>
+          <w:tcPr>
+            <w:tcW w:type="dxa" w:w="7060"/>
+            <w:tcBorders>
+              <w:top w:val="single" w:color="AAAAAA" w:sz="4"/>
+              <w:left w:val="single" w:color="AAAAAA" w:sz="4"/>
+              <w:bottom w:val="single" w:color="AAAAAA" w:sz="4"/>
+              <w:right w:val="single" w:color="AAAAAA" w:sz="4"/>
+            </w:tcBorders>
+            <w:tcMar>
+              <w:top w:type="dxa" w:w="80"/>
+              <w:left w:type="dxa" w:w="120"/>
+              <w:bottom w:type="dxa" w:w="80"/>
+              <w:right w:type="dxa" w:w="120"/>
+            </w:tcMar>
+          </w:tcPr>
+          <w:p>
+            <w:r>
+              <w:rPr>
+                <w:rFonts w:ascii="Arial" w:cs="Arial" w:eastAsia="Arial" w:hAnsi="Arial"/>
+                <w:b w:val="false"/>
+                <w:bCs w:val="false"/>
+              </w:rPr>
+              <w:t xml:space="preserve">Two rows relabeled from "Public IPv4" to "Public IPv4 (SSH Host)": one in Section 2 (Deployment Summary at-a-glance) and one in Section 3.1 (Droplet Identification). The added parenthetical makes explicit that this captured value is the input to the Setup Wizard's SSH Host field on its Server (SSH) Connection page. The issue was identified during a wizard run when an operator noted that the wizard label "SSH Host" had no obvious match in the Deployment Record. Metadata Last Updated bumped to 05-02-26 06:50. No other content changes.</w:t>
+            </w:r>
+          </w:p>
+        </w:tc>
+      </w:tr>
+      <w:tr>
+        <w:tc>
+          <w:tcPr>
+            <w:tcW w:type="dxa" w:w="800"/>
+            <w:tcBorders>
+              <w:top w:val="single" w:color="AAAAAA" w:sz="4"/>
+              <w:left w:val="single" w:color="AAAAAA" w:sz="4"/>
+              <w:bottom w:val="single" w:color="AAAAAA" w:sz="4"/>
+              <w:right w:val="single" w:color="AAAAAA" w:sz="4"/>
+            </w:tcBorders>
+            <w:shd w:fill="F2F7FB" w:val="clear"/>
+            <w:tcMar>
+              <w:top w:type="dxa" w:w="80"/>
+              <w:left w:type="dxa" w:w="120"/>
+              <w:bottom w:type="dxa" w:w="80"/>
+              <w:right w:type="dxa" w:w="120"/>
+            </w:tcMar>
+          </w:tcPr>
+          <w:p>
+            <w:r>
+              <w:rPr>
+                <w:rFonts w:ascii="Arial" w:cs="Arial" w:eastAsia="Arial" w:hAnsi="Arial"/>
+                <w:b w:val="false"/>
+                <w:bCs w:val="false"/>
+              </w:rPr>
               <w:t xml:space="preserve">1.2</w:t>
             </w:r>
           </w:p>
@@ -8943,6 +9113,7 @@
               <w:bottom w:val="single" w:color="AAAAAA" w:sz="4"/>
               <w:right w:val="single" w:color="AAAAAA" w:sz="4"/>
             </w:tcBorders>
+            <w:shd w:fill="F2F7FB" w:val="clear"/>
             <w:tcMar>
               <w:top w:type="dxa" w:w="80"/>
               <w:left w:type="dxa" w:w="120"/>
@@ -8970,6 +9141,7 @@
               <w:bottom w:val="single" w:color="AAAAAA" w:sz="4"/>
               <w:right w:val="single" w:color="AAAAAA" w:sz="4"/>
             </w:tcBorders>
+            <w:shd w:fill="F2F7FB" w:val="clear"/>
             <w:tcMar>
               <w:top w:type="dxa" w:w="80"/>
               <w:left w:type="dxa" w:w="120"/>
@@ -8999,7 +9171,6 @@
               <w:bottom w:val="single" w:color="AAAAAA" w:sz="4"/>
               <w:right w:val="single" w:color="AAAAAA" w:sz="4"/>
             </w:tcBorders>
-            <w:shd w:fill="F2F7FB" w:val="clear"/>
             <w:tcMar>
               <w:top w:type="dxa" w:w="80"/>
               <w:left w:type="dxa" w:w="120"/>
@@ -9027,7 +9198,6 @@
               <w:bottom w:val="single" w:color="AAAAAA" w:sz="4"/>
               <w:right w:val="single" w:color="AAAAAA" w:sz="4"/>
             </w:tcBorders>
-            <w:shd w:fill="F2F7FB" w:val="clear"/>
             <w:tcMar>
               <w:top w:type="dxa" w:w="80"/>
               <w:left w:type="dxa" w:w="120"/>
@@ -9055,7 +9225,6 @@
               <w:bottom w:val="single" w:color="AAAAAA" w:sz="4"/>
               <w:right w:val="single" w:color="AAAAAA" w:sz="4"/>
             </w:tcBorders>
-            <w:shd w:fill="F2F7FB" w:val="clear"/>
             <w:tcMar>
               <w:top w:type="dxa" w:w="80"/>
               <w:left w:type="dxa" w:w="120"/>
@@ -9085,6 +9254,7 @@
               <w:bottom w:val="single" w:color="AAAAAA" w:sz="4"/>
               <w:right w:val="single" w:color="AAAAAA" w:sz="4"/>
             </w:tcBorders>
+            <w:shd w:fill="F2F7FB" w:val="clear"/>
             <w:tcMar>
               <w:top w:type="dxa" w:w="80"/>
               <w:left w:type="dxa" w:w="120"/>
@@ -9112,6 +9282,7 @@
               <w:bottom w:val="single" w:color="AAAAAA" w:sz="4"/>
               <w:right w:val="single" w:color="AAAAAA" w:sz="4"/>
             </w:tcBorders>
+            <w:shd w:fill="F2F7FB" w:val="clear"/>
             <w:tcMar>
               <w:top w:type="dxa" w:w="80"/>
               <w:left w:type="dxa" w:w="120"/>
@@ -9139,6 +9310,7 @@
               <w:bottom w:val="single" w:color="AAAAAA" w:sz="4"/>
               <w:right w:val="single" w:color="AAAAAA" w:sz="4"/>
             </w:tcBorders>
+            <w:shd w:fill="F2F7FB" w:val="clear"/>
             <w:tcMar>
               <w:top w:type="dxa" w:w="80"/>
               <w:left w:type="dxa" w:w="120"/>

</xml_diff>